<commit_message>
AI A2: Updated Report
</commit_message>
<xml_diff>
--- a/Semester-6/AI/Assignment 2/assignment2_report.docx
+++ b/Semester-6/AI/Assignment 2/assignment2_report.docx
@@ -158,7 +158,27 @@
           <w:szCs w:val="36"/>
           <w:lang w:val="en"/>
         </w:rPr>
-        <w:t>Muhammad Moiz Ansari    [23i-0523]</w:t>
+        <w:t xml:space="preserve">Muhammad Moiz Ansari </w:t>
+      </w:r>
+      <w:proofErr w:type="gramStart"/>
+      <w:r>
+        <w:rPr>
+          <w:rFonts w:ascii="Calisto MT" w:eastAsia="Lustria" w:hAnsi="Calisto MT" w:cs="Lustria"/>
+          <w:sz w:val="36"/>
+          <w:szCs w:val="36"/>
+          <w:lang w:val="en"/>
+        </w:rPr>
+        <w:t xml:space="preserve">   [</w:t>
+      </w:r>
+      <w:proofErr w:type="gramEnd"/>
+      <w:r>
+        <w:rPr>
+          <w:rFonts w:ascii="Calisto MT" w:eastAsia="Lustria" w:hAnsi="Calisto MT" w:cs="Lustria"/>
+          <w:sz w:val="36"/>
+          <w:szCs w:val="36"/>
+          <w:lang w:val="en"/>
+        </w:rPr>
+        <w:t>23i-0523]</w:t>
       </w:r>
     </w:p>
     <w:p>
@@ -265,7 +285,7 @@
           <w:lang w:val="en"/>
         </w:rPr>
         <w:drawing>
-          <wp:inline distT="0" distB="0" distL="0" distR="0" wp14:anchorId="4BE5D8D7" wp14:editId="6E5CE95F">
+          <wp:inline distT="0" distB="0" distL="0" distR="0" wp14:anchorId="4BE5D8D7" wp14:editId="1E44DAAC">
             <wp:extent cx="1892300" cy="1885950"/>
             <wp:effectExtent l="0" t="0" r="0" b="0"/>
             <wp:docPr id="4" name="Picture 6"/>
@@ -411,7 +431,7 @@
           <w:r>
             <w:fldChar w:fldCharType="separate"/>
           </w:r>
-          <w:hyperlink w:anchor="_Toc225681839" w:history="1">
+          <w:hyperlink w:anchor="_Toc225687378" w:history="1">
             <w:r>
               <w:rPr>
                 <w:rStyle w:val="Hyperlink"/>
@@ -439,7 +459,7 @@
                 <w:noProof/>
                 <w:webHidden/>
               </w:rPr>
-              <w:instrText xml:space="preserve"> PAGEREF _Toc225681839 \h </w:instrText>
+              <w:instrText xml:space="preserve"> PAGEREF _Toc225687378 \h </w:instrText>
             </w:r>
             <w:r>
               <w:rPr>
@@ -483,7 +503,7 @@
               <w14:ligatures w14:val="standardContextual"/>
             </w:rPr>
           </w:pPr>
-          <w:hyperlink w:anchor="_Toc225681840" w:history="1">
+          <w:hyperlink w:anchor="_Toc225687379" w:history="1">
             <w:r>
               <w:rPr>
                 <w:rStyle w:val="Hyperlink"/>
@@ -511,7 +531,7 @@
                 <w:noProof/>
                 <w:webHidden/>
               </w:rPr>
-              <w:instrText xml:space="preserve"> PAGEREF _Toc225681840 \h </w:instrText>
+              <w:instrText xml:space="preserve"> PAGEREF _Toc225687379 \h </w:instrText>
             </w:r>
             <w:r>
               <w:rPr>
@@ -555,7 +575,7 @@
               <w14:ligatures w14:val="standardContextual"/>
             </w:rPr>
           </w:pPr>
-          <w:hyperlink w:anchor="_Toc225681841" w:history="1">
+          <w:hyperlink w:anchor="_Toc225687380" w:history="1">
             <w:r>
               <w:rPr>
                 <w:rStyle w:val="Hyperlink"/>
@@ -583,7 +603,7 @@
                 <w:noProof/>
                 <w:webHidden/>
               </w:rPr>
-              <w:instrText xml:space="preserve"> PAGEREF _Toc225681841 \h </w:instrText>
+              <w:instrText xml:space="preserve"> PAGEREF _Toc225687380 \h </w:instrText>
             </w:r>
             <w:r>
               <w:rPr>
@@ -627,7 +647,7 @@
               <w14:ligatures w14:val="standardContextual"/>
             </w:rPr>
           </w:pPr>
-          <w:hyperlink w:anchor="_Toc225681842" w:history="1">
+          <w:hyperlink w:anchor="_Toc225687381" w:history="1">
             <w:r>
               <w:rPr>
                 <w:rStyle w:val="Hyperlink"/>
@@ -655,7 +675,7 @@
                 <w:noProof/>
                 <w:webHidden/>
               </w:rPr>
-              <w:instrText xml:space="preserve"> PAGEREF _Toc225681842 \h </w:instrText>
+              <w:instrText xml:space="preserve"> PAGEREF _Toc225687381 \h </w:instrText>
             </w:r>
             <w:r>
               <w:rPr>
@@ -699,7 +719,7 @@
               <w14:ligatures w14:val="standardContextual"/>
             </w:rPr>
           </w:pPr>
-          <w:hyperlink w:anchor="_Toc225681843" w:history="1">
+          <w:hyperlink w:anchor="_Toc225687382" w:history="1">
             <w:r>
               <w:rPr>
                 <w:rStyle w:val="Hyperlink"/>
@@ -727,7 +747,7 @@
                 <w:noProof/>
                 <w:webHidden/>
               </w:rPr>
-              <w:instrText xml:space="preserve"> PAGEREF _Toc225681843 \h </w:instrText>
+              <w:instrText xml:space="preserve"> PAGEREF _Toc225687382 \h </w:instrText>
             </w:r>
             <w:r>
               <w:rPr>
@@ -771,7 +791,7 @@
               <w14:ligatures w14:val="standardContextual"/>
             </w:rPr>
           </w:pPr>
-          <w:hyperlink w:anchor="_Toc225681844" w:history="1">
+          <w:hyperlink w:anchor="_Toc225687383" w:history="1">
             <w:r>
               <w:rPr>
                 <w:rStyle w:val="Hyperlink"/>
@@ -799,7 +819,7 @@
                 <w:noProof/>
                 <w:webHidden/>
               </w:rPr>
-              <w:instrText xml:space="preserve"> PAGEREF _Toc225681844 \h </w:instrText>
+              <w:instrText xml:space="preserve"> PAGEREF _Toc225687383 \h </w:instrText>
             </w:r>
             <w:r>
               <w:rPr>
@@ -843,7 +863,7 @@
               <w14:ligatures w14:val="standardContextual"/>
             </w:rPr>
           </w:pPr>
-          <w:hyperlink w:anchor="_Toc225681845" w:history="1">
+          <w:hyperlink w:anchor="_Toc225687384" w:history="1">
             <w:r>
               <w:rPr>
                 <w:rStyle w:val="Hyperlink"/>
@@ -871,7 +891,7 @@
                 <w:noProof/>
                 <w:webHidden/>
               </w:rPr>
-              <w:instrText xml:space="preserve"> PAGEREF _Toc225681845 \h </w:instrText>
+              <w:instrText xml:space="preserve"> PAGEREF _Toc225687384 \h </w:instrText>
             </w:r>
             <w:r>
               <w:rPr>
@@ -915,7 +935,7 @@
               <w14:ligatures w14:val="standardContextual"/>
             </w:rPr>
           </w:pPr>
-          <w:hyperlink w:anchor="_Toc225681846" w:history="1">
+          <w:hyperlink w:anchor="_Toc225687385" w:history="1">
             <w:r>
               <w:rPr>
                 <w:rStyle w:val="Hyperlink"/>
@@ -943,7 +963,7 @@
                 <w:noProof/>
                 <w:webHidden/>
               </w:rPr>
-              <w:instrText xml:space="preserve"> PAGEREF _Toc225681846 \h </w:instrText>
+              <w:instrText xml:space="preserve"> PAGEREF _Toc225687385 \h </w:instrText>
             </w:r>
             <w:r>
               <w:rPr>
@@ -987,7 +1007,7 @@
               <w14:ligatures w14:val="standardContextual"/>
             </w:rPr>
           </w:pPr>
-          <w:hyperlink w:anchor="_Toc225681847" w:history="1">
+          <w:hyperlink w:anchor="_Toc225687386" w:history="1">
             <w:r>
               <w:rPr>
                 <w:rStyle w:val="Hyperlink"/>
@@ -1015,7 +1035,7 @@
                 <w:noProof/>
                 <w:webHidden/>
               </w:rPr>
-              <w:instrText xml:space="preserve"> PAGEREF _Toc225681847 \h </w:instrText>
+              <w:instrText xml:space="preserve"> PAGEREF _Toc225687386 \h </w:instrText>
             </w:r>
             <w:r>
               <w:rPr>
@@ -1059,7 +1079,7 @@
               <w14:ligatures w14:val="standardContextual"/>
             </w:rPr>
           </w:pPr>
-          <w:hyperlink w:anchor="_Toc225681848" w:history="1">
+          <w:hyperlink w:anchor="_Toc225687387" w:history="1">
             <w:r>
               <w:rPr>
                 <w:rStyle w:val="Hyperlink"/>
@@ -1087,7 +1107,7 @@
                 <w:noProof/>
                 <w:webHidden/>
               </w:rPr>
-              <w:instrText xml:space="preserve"> PAGEREF _Toc225681848 \h </w:instrText>
+              <w:instrText xml:space="preserve"> PAGEREF _Toc225687387 \h </w:instrText>
             </w:r>
             <w:r>
               <w:rPr>
@@ -1131,7 +1151,7 @@
               <w14:ligatures w14:val="standardContextual"/>
             </w:rPr>
           </w:pPr>
-          <w:hyperlink w:anchor="_Toc225681849" w:history="1">
+          <w:hyperlink w:anchor="_Toc225687388" w:history="1">
             <w:r>
               <w:rPr>
                 <w:rStyle w:val="Hyperlink"/>
@@ -1159,7 +1179,7 @@
                 <w:noProof/>
                 <w:webHidden/>
               </w:rPr>
-              <w:instrText xml:space="preserve"> PAGEREF _Toc225681849 \h </w:instrText>
+              <w:instrText xml:space="preserve"> PAGEREF _Toc225687388 \h </w:instrText>
             </w:r>
             <w:r>
               <w:rPr>
@@ -1203,7 +1223,7 @@
               <w14:ligatures w14:val="standardContextual"/>
             </w:rPr>
           </w:pPr>
-          <w:hyperlink w:anchor="_Toc225681850" w:history="1">
+          <w:hyperlink w:anchor="_Toc225687389" w:history="1">
             <w:r>
               <w:rPr>
                 <w:rStyle w:val="Hyperlink"/>
@@ -1231,7 +1251,7 @@
                 <w:noProof/>
                 <w:webHidden/>
               </w:rPr>
-              <w:instrText xml:space="preserve"> PAGEREF _Toc225681850 \h </w:instrText>
+              <w:instrText xml:space="preserve"> PAGEREF _Toc225687389 \h </w:instrText>
             </w:r>
             <w:r>
               <w:rPr>
@@ -1275,7 +1295,7 @@
               <w14:ligatures w14:val="standardContextual"/>
             </w:rPr>
           </w:pPr>
-          <w:hyperlink w:anchor="_Toc225681851" w:history="1">
+          <w:hyperlink w:anchor="_Toc225687390" w:history="1">
             <w:r>
               <w:rPr>
                 <w:rStyle w:val="Hyperlink"/>
@@ -1303,7 +1323,7 @@
                 <w:noProof/>
                 <w:webHidden/>
               </w:rPr>
-              <w:instrText xml:space="preserve"> PAGEREF _Toc225681851 \h </w:instrText>
+              <w:instrText xml:space="preserve"> PAGEREF _Toc225687390 \h </w:instrText>
             </w:r>
             <w:r>
               <w:rPr>
@@ -1347,7 +1367,7 @@
               <w14:ligatures w14:val="standardContextual"/>
             </w:rPr>
           </w:pPr>
-          <w:hyperlink w:anchor="_Toc225681852" w:history="1">
+          <w:hyperlink w:anchor="_Toc225687391" w:history="1">
             <w:r>
               <w:rPr>
                 <w:rStyle w:val="Hyperlink"/>
@@ -1375,7 +1395,7 @@
                 <w:noProof/>
                 <w:webHidden/>
               </w:rPr>
-              <w:instrText xml:space="preserve"> PAGEREF _Toc225681852 \h </w:instrText>
+              <w:instrText xml:space="preserve"> PAGEREF _Toc225687391 \h </w:instrText>
             </w:r>
             <w:r>
               <w:rPr>
@@ -1419,7 +1439,7 @@
               <w14:ligatures w14:val="standardContextual"/>
             </w:rPr>
           </w:pPr>
-          <w:hyperlink w:anchor="_Toc225681853" w:history="1">
+          <w:hyperlink w:anchor="_Toc225687392" w:history="1">
             <w:r>
               <w:rPr>
                 <w:rStyle w:val="Hyperlink"/>
@@ -1447,7 +1467,7 @@
                 <w:noProof/>
                 <w:webHidden/>
               </w:rPr>
-              <w:instrText xml:space="preserve"> PAGEREF _Toc225681853 \h </w:instrText>
+              <w:instrText xml:space="preserve"> PAGEREF _Toc225687392 \h </w:instrText>
             </w:r>
             <w:r>
               <w:rPr>
@@ -1491,7 +1511,7 @@
               <w14:ligatures w14:val="standardContextual"/>
             </w:rPr>
           </w:pPr>
-          <w:hyperlink w:anchor="_Toc225681854" w:history="1">
+          <w:hyperlink w:anchor="_Toc225687393" w:history="1">
             <w:r>
               <w:rPr>
                 <w:rStyle w:val="Hyperlink"/>
@@ -1519,7 +1539,7 @@
                 <w:noProof/>
                 <w:webHidden/>
               </w:rPr>
-              <w:instrText xml:space="preserve"> PAGEREF _Toc225681854 \h </w:instrText>
+              <w:instrText xml:space="preserve"> PAGEREF _Toc225687393 \h </w:instrText>
             </w:r>
             <w:r>
               <w:rPr>
@@ -1563,7 +1583,7 @@
               <w14:ligatures w14:val="standardContextual"/>
             </w:rPr>
           </w:pPr>
-          <w:hyperlink w:anchor="_Toc225681855" w:history="1">
+          <w:hyperlink w:anchor="_Toc225687394" w:history="1">
             <w:r>
               <w:rPr>
                 <w:rStyle w:val="Hyperlink"/>
@@ -1591,7 +1611,7 @@
                 <w:noProof/>
                 <w:webHidden/>
               </w:rPr>
-              <w:instrText xml:space="preserve"> PAGEREF _Toc225681855 \h </w:instrText>
+              <w:instrText xml:space="preserve"> PAGEREF _Toc225687394 \h </w:instrText>
             </w:r>
             <w:r>
               <w:rPr>
@@ -1635,7 +1655,7 @@
               <w14:ligatures w14:val="standardContextual"/>
             </w:rPr>
           </w:pPr>
-          <w:hyperlink w:anchor="_Toc225681856" w:history="1">
+          <w:hyperlink w:anchor="_Toc225687395" w:history="1">
             <w:r>
               <w:rPr>
                 <w:rStyle w:val="Hyperlink"/>
@@ -1663,7 +1683,7 @@
                 <w:noProof/>
                 <w:webHidden/>
               </w:rPr>
-              <w:instrText xml:space="preserve"> PAGEREF _Toc225681856 \h </w:instrText>
+              <w:instrText xml:space="preserve"> PAGEREF _Toc225687395 \h </w:instrText>
             </w:r>
             <w:r>
               <w:rPr>
@@ -1707,7 +1727,7 @@
               <w14:ligatures w14:val="standardContextual"/>
             </w:rPr>
           </w:pPr>
-          <w:hyperlink w:anchor="_Toc225681857" w:history="1">
+          <w:hyperlink w:anchor="_Toc225687396" w:history="1">
             <w:r>
               <w:rPr>
                 <w:rStyle w:val="Hyperlink"/>
@@ -1735,7 +1755,7 @@
                 <w:noProof/>
                 <w:webHidden/>
               </w:rPr>
-              <w:instrText xml:space="preserve"> PAGEREF _Toc225681857 \h </w:instrText>
+              <w:instrText xml:space="preserve"> PAGEREF _Toc225687396 \h </w:instrText>
             </w:r>
             <w:r>
               <w:rPr>
@@ -1779,7 +1799,7 @@
               <w14:ligatures w14:val="standardContextual"/>
             </w:rPr>
           </w:pPr>
-          <w:hyperlink w:anchor="_Toc225681858" w:history="1">
+          <w:hyperlink w:anchor="_Toc225687397" w:history="1">
             <w:r>
               <w:rPr>
                 <w:rStyle w:val="Hyperlink"/>
@@ -1807,7 +1827,7 @@
                 <w:noProof/>
                 <w:webHidden/>
               </w:rPr>
-              <w:instrText xml:space="preserve"> PAGEREF _Toc225681858 \h </w:instrText>
+              <w:instrText xml:space="preserve"> PAGEREF _Toc225687397 \h </w:instrText>
             </w:r>
             <w:r>
               <w:rPr>
@@ -1851,7 +1871,7 @@
               <w14:ligatures w14:val="standardContextual"/>
             </w:rPr>
           </w:pPr>
-          <w:hyperlink w:anchor="_Toc225681859" w:history="1">
+          <w:hyperlink w:anchor="_Toc225687398" w:history="1">
             <w:r>
               <w:rPr>
                 <w:rStyle w:val="Hyperlink"/>
@@ -1879,7 +1899,7 @@
                 <w:noProof/>
                 <w:webHidden/>
               </w:rPr>
-              <w:instrText xml:space="preserve"> PAGEREF _Toc225681859 \h </w:instrText>
+              <w:instrText xml:space="preserve"> PAGEREF _Toc225687398 \h </w:instrText>
             </w:r>
             <w:r>
               <w:rPr>
@@ -1923,7 +1943,7 @@
               <w14:ligatures w14:val="standardContextual"/>
             </w:rPr>
           </w:pPr>
-          <w:hyperlink w:anchor="_Toc225681860" w:history="1">
+          <w:hyperlink w:anchor="_Toc225687399" w:history="1">
             <w:r>
               <w:rPr>
                 <w:rStyle w:val="Hyperlink"/>
@@ -1951,7 +1971,7 @@
                 <w:noProof/>
                 <w:webHidden/>
               </w:rPr>
-              <w:instrText xml:space="preserve"> PAGEREF _Toc225681860 \h </w:instrText>
+              <w:instrText xml:space="preserve"> PAGEREF _Toc225687399 \h </w:instrText>
             </w:r>
             <w:r>
               <w:rPr>
@@ -1995,7 +2015,7 @@
               <w14:ligatures w14:val="standardContextual"/>
             </w:rPr>
           </w:pPr>
-          <w:hyperlink w:anchor="_Toc225681861" w:history="1">
+          <w:hyperlink w:anchor="_Toc225687400" w:history="1">
             <w:r>
               <w:rPr>
                 <w:rStyle w:val="Hyperlink"/>
@@ -2023,7 +2043,7 @@
                 <w:noProof/>
                 <w:webHidden/>
               </w:rPr>
-              <w:instrText xml:space="preserve"> PAGEREF _Toc225681861 \h </w:instrText>
+              <w:instrText xml:space="preserve"> PAGEREF _Toc225687400 \h </w:instrText>
             </w:r>
             <w:r>
               <w:rPr>
@@ -2067,7 +2087,7 @@
               <w14:ligatures w14:val="standardContextual"/>
             </w:rPr>
           </w:pPr>
-          <w:hyperlink w:anchor="_Toc225681862" w:history="1">
+          <w:hyperlink w:anchor="_Toc225687401" w:history="1">
             <w:r>
               <w:rPr>
                 <w:rStyle w:val="Hyperlink"/>
@@ -2095,7 +2115,7 @@
                 <w:noProof/>
                 <w:webHidden/>
               </w:rPr>
-              <w:instrText xml:space="preserve"> PAGEREF _Toc225681862 \h </w:instrText>
+              <w:instrText xml:space="preserve"> PAGEREF _Toc225687401 \h </w:instrText>
             </w:r>
             <w:r>
               <w:rPr>
@@ -2139,7 +2159,7 @@
               <w14:ligatures w14:val="standardContextual"/>
             </w:rPr>
           </w:pPr>
-          <w:hyperlink w:anchor="_Toc225681863" w:history="1">
+          <w:hyperlink w:anchor="_Toc225687402" w:history="1">
             <w:r>
               <w:rPr>
                 <w:rStyle w:val="Hyperlink"/>
@@ -2167,7 +2187,7 @@
                 <w:noProof/>
                 <w:webHidden/>
               </w:rPr>
-              <w:instrText xml:space="preserve"> PAGEREF _Toc225681863 \h </w:instrText>
+              <w:instrText xml:space="preserve"> PAGEREF _Toc225687402 \h </w:instrText>
             </w:r>
             <w:r>
               <w:rPr>
@@ -2211,7 +2231,7 @@
               <w14:ligatures w14:val="standardContextual"/>
             </w:rPr>
           </w:pPr>
-          <w:hyperlink w:anchor="_Toc225681864" w:history="1">
+          <w:hyperlink w:anchor="_Toc225687403" w:history="1">
             <w:r>
               <w:rPr>
                 <w:rStyle w:val="Hyperlink"/>
@@ -2239,7 +2259,7 @@
                 <w:noProof/>
                 <w:webHidden/>
               </w:rPr>
-              <w:instrText xml:space="preserve"> PAGEREF _Toc225681864 \h </w:instrText>
+              <w:instrText xml:space="preserve"> PAGEREF _Toc225687403 \h </w:instrText>
             </w:r>
             <w:r>
               <w:rPr>
@@ -2283,7 +2303,7 @@
               <w14:ligatures w14:val="standardContextual"/>
             </w:rPr>
           </w:pPr>
-          <w:hyperlink w:anchor="_Toc225681865" w:history="1">
+          <w:hyperlink w:anchor="_Toc225687404" w:history="1">
             <w:r>
               <w:rPr>
                 <w:rStyle w:val="Hyperlink"/>
@@ -2311,7 +2331,7 @@
                 <w:noProof/>
                 <w:webHidden/>
               </w:rPr>
-              <w:instrText xml:space="preserve"> PAGEREF _Toc225681865 \h </w:instrText>
+              <w:instrText xml:space="preserve"> PAGEREF _Toc225687404 \h </w:instrText>
             </w:r>
             <w:r>
               <w:rPr>
@@ -2355,7 +2375,7 @@
               <w14:ligatures w14:val="standardContextual"/>
             </w:rPr>
           </w:pPr>
-          <w:hyperlink w:anchor="_Toc225681866" w:history="1">
+          <w:hyperlink w:anchor="_Toc225687405" w:history="1">
             <w:r>
               <w:rPr>
                 <w:rStyle w:val="Hyperlink"/>
@@ -2383,7 +2403,7 @@
                 <w:noProof/>
                 <w:webHidden/>
               </w:rPr>
-              <w:instrText xml:space="preserve"> PAGEREF _Toc225681866 \h </w:instrText>
+              <w:instrText xml:space="preserve"> PAGEREF _Toc225687405 \h </w:instrText>
             </w:r>
             <w:r>
               <w:rPr>
@@ -2427,7 +2447,7 @@
               <w14:ligatures w14:val="standardContextual"/>
             </w:rPr>
           </w:pPr>
-          <w:hyperlink w:anchor="_Toc225681867" w:history="1">
+          <w:hyperlink w:anchor="_Toc225687406" w:history="1">
             <w:r>
               <w:rPr>
                 <w:rStyle w:val="Hyperlink"/>
@@ -2455,7 +2475,7 @@
                 <w:noProof/>
                 <w:webHidden/>
               </w:rPr>
-              <w:instrText xml:space="preserve"> PAGEREF _Toc225681867 \h </w:instrText>
+              <w:instrText xml:space="preserve"> PAGEREF _Toc225687406 \h </w:instrText>
             </w:r>
             <w:r>
               <w:rPr>
@@ -2499,7 +2519,7 @@
               <w14:ligatures w14:val="standardContextual"/>
             </w:rPr>
           </w:pPr>
-          <w:hyperlink w:anchor="_Toc225681868" w:history="1">
+          <w:hyperlink w:anchor="_Toc225687407" w:history="1">
             <w:r>
               <w:rPr>
                 <w:rStyle w:val="Hyperlink"/>
@@ -2527,7 +2547,7 @@
                 <w:noProof/>
                 <w:webHidden/>
               </w:rPr>
-              <w:instrText xml:space="preserve"> PAGEREF _Toc225681868 \h </w:instrText>
+              <w:instrText xml:space="preserve"> PAGEREF _Toc225687407 \h </w:instrText>
             </w:r>
             <w:r>
               <w:rPr>
@@ -2571,7 +2591,7 @@
               <w14:ligatures w14:val="standardContextual"/>
             </w:rPr>
           </w:pPr>
-          <w:hyperlink w:anchor="_Toc225681869" w:history="1">
+          <w:hyperlink w:anchor="_Toc225687408" w:history="1">
             <w:r>
               <w:rPr>
                 <w:rStyle w:val="Hyperlink"/>
@@ -2599,7 +2619,7 @@
                 <w:noProof/>
                 <w:webHidden/>
               </w:rPr>
-              <w:instrText xml:space="preserve"> PAGEREF _Toc225681869 \h </w:instrText>
+              <w:instrText xml:space="preserve"> PAGEREF _Toc225687408 \h </w:instrText>
             </w:r>
             <w:r>
               <w:rPr>
@@ -2643,7 +2663,7 @@
               <w14:ligatures w14:val="standardContextual"/>
             </w:rPr>
           </w:pPr>
-          <w:hyperlink w:anchor="_Toc225681870" w:history="1">
+          <w:hyperlink w:anchor="_Toc225687409" w:history="1">
             <w:r>
               <w:rPr>
                 <w:rStyle w:val="Hyperlink"/>
@@ -2671,7 +2691,7 @@
                 <w:noProof/>
                 <w:webHidden/>
               </w:rPr>
-              <w:instrText xml:space="preserve"> PAGEREF _Toc225681870 \h </w:instrText>
+              <w:instrText xml:space="preserve"> PAGEREF _Toc225687409 \h </w:instrText>
             </w:r>
             <w:r>
               <w:rPr>
@@ -2715,7 +2735,7 @@
               <w14:ligatures w14:val="standardContextual"/>
             </w:rPr>
           </w:pPr>
-          <w:hyperlink w:anchor="_Toc225681871" w:history="1">
+          <w:hyperlink w:anchor="_Toc225687410" w:history="1">
             <w:r>
               <w:rPr>
                 <w:rStyle w:val="Hyperlink"/>
@@ -2743,7 +2763,7 @@
                 <w:noProof/>
                 <w:webHidden/>
               </w:rPr>
-              <w:instrText xml:space="preserve"> PAGEREF _Toc225681871 \h </w:instrText>
+              <w:instrText xml:space="preserve"> PAGEREF _Toc225687410 \h </w:instrText>
             </w:r>
             <w:r>
               <w:rPr>
@@ -2787,7 +2807,7 @@
               <w14:ligatures w14:val="standardContextual"/>
             </w:rPr>
           </w:pPr>
-          <w:hyperlink w:anchor="_Toc225681872" w:history="1">
+          <w:hyperlink w:anchor="_Toc225687411" w:history="1">
             <w:r>
               <w:rPr>
                 <w:rStyle w:val="Hyperlink"/>
@@ -2815,7 +2835,7 @@
                 <w:noProof/>
                 <w:webHidden/>
               </w:rPr>
-              <w:instrText xml:space="preserve"> PAGEREF _Toc225681872 \h </w:instrText>
+              <w:instrText xml:space="preserve"> PAGEREF _Toc225687411 \h </w:instrText>
             </w:r>
             <w:r>
               <w:rPr>
@@ -2859,7 +2879,7 @@
               <w14:ligatures w14:val="standardContextual"/>
             </w:rPr>
           </w:pPr>
-          <w:hyperlink w:anchor="_Toc225681873" w:history="1">
+          <w:hyperlink w:anchor="_Toc225687412" w:history="1">
             <w:r>
               <w:rPr>
                 <w:rStyle w:val="Hyperlink"/>
@@ -2887,7 +2907,7 @@
                 <w:noProof/>
                 <w:webHidden/>
               </w:rPr>
-              <w:instrText xml:space="preserve"> PAGEREF _Toc225681873 \h </w:instrText>
+              <w:instrText xml:space="preserve"> PAGEREF _Toc225687412 \h </w:instrText>
             </w:r>
             <w:r>
               <w:rPr>
@@ -2931,7 +2951,7 @@
               <w14:ligatures w14:val="standardContextual"/>
             </w:rPr>
           </w:pPr>
-          <w:hyperlink w:anchor="_Toc225681874" w:history="1">
+          <w:hyperlink w:anchor="_Toc225687413" w:history="1">
             <w:r>
               <w:rPr>
                 <w:rStyle w:val="Hyperlink"/>
@@ -2959,7 +2979,7 @@
                 <w:noProof/>
                 <w:webHidden/>
               </w:rPr>
-              <w:instrText xml:space="preserve"> PAGEREF _Toc225681874 \h </w:instrText>
+              <w:instrText xml:space="preserve"> PAGEREF _Toc225687413 \h </w:instrText>
             </w:r>
             <w:r>
               <w:rPr>
@@ -3003,7 +3023,7 @@
               <w14:ligatures w14:val="standardContextual"/>
             </w:rPr>
           </w:pPr>
-          <w:hyperlink w:anchor="_Toc225681875" w:history="1">
+          <w:hyperlink w:anchor="_Toc225687414" w:history="1">
             <w:r>
               <w:rPr>
                 <w:rStyle w:val="Hyperlink"/>
@@ -3031,7 +3051,7 @@
                 <w:noProof/>
                 <w:webHidden/>
               </w:rPr>
-              <w:instrText xml:space="preserve"> PAGEREF _Toc225681875 \h </w:instrText>
+              <w:instrText xml:space="preserve"> PAGEREF _Toc225687414 \h </w:instrText>
             </w:r>
             <w:r>
               <w:rPr>
@@ -3075,7 +3095,7 @@
               <w14:ligatures w14:val="standardContextual"/>
             </w:rPr>
           </w:pPr>
-          <w:hyperlink w:anchor="_Toc225681876" w:history="1">
+          <w:hyperlink w:anchor="_Toc225687415" w:history="1">
             <w:r>
               <w:rPr>
                 <w:rStyle w:val="Hyperlink"/>
@@ -3103,7 +3123,7 @@
                 <w:noProof/>
                 <w:webHidden/>
               </w:rPr>
-              <w:instrText xml:space="preserve"> PAGEREF _Toc225681876 \h </w:instrText>
+              <w:instrText xml:space="preserve"> PAGEREF _Toc225687415 \h </w:instrText>
             </w:r>
             <w:r>
               <w:rPr>
@@ -3147,7 +3167,7 @@
               <w14:ligatures w14:val="standardContextual"/>
             </w:rPr>
           </w:pPr>
-          <w:hyperlink w:anchor="_Toc225681877" w:history="1">
+          <w:hyperlink w:anchor="_Toc225687416" w:history="1">
             <w:r>
               <w:rPr>
                 <w:rStyle w:val="Hyperlink"/>
@@ -3175,7 +3195,7 @@
                 <w:noProof/>
                 <w:webHidden/>
               </w:rPr>
-              <w:instrText xml:space="preserve"> PAGEREF _Toc225681877 \h </w:instrText>
+              <w:instrText xml:space="preserve"> PAGEREF _Toc225687416 \h </w:instrText>
             </w:r>
             <w:r>
               <w:rPr>
@@ -3219,7 +3239,7 @@
               <w14:ligatures w14:val="standardContextual"/>
             </w:rPr>
           </w:pPr>
-          <w:hyperlink w:anchor="_Toc225681878" w:history="1">
+          <w:hyperlink w:anchor="_Toc225687417" w:history="1">
             <w:r>
               <w:rPr>
                 <w:rStyle w:val="Hyperlink"/>
@@ -3247,7 +3267,7 @@
                 <w:noProof/>
                 <w:webHidden/>
               </w:rPr>
-              <w:instrText xml:space="preserve"> PAGEREF _Toc225681878 \h </w:instrText>
+              <w:instrText xml:space="preserve"> PAGEREF _Toc225687417 \h </w:instrText>
             </w:r>
             <w:r>
               <w:rPr>
@@ -3291,7 +3311,7 @@
               <w14:ligatures w14:val="standardContextual"/>
             </w:rPr>
           </w:pPr>
-          <w:hyperlink w:anchor="_Toc225681879" w:history="1">
+          <w:hyperlink w:anchor="_Toc225687418" w:history="1">
             <w:r>
               <w:rPr>
                 <w:rStyle w:val="Hyperlink"/>
@@ -3319,7 +3339,79 @@
                 <w:noProof/>
                 <w:webHidden/>
               </w:rPr>
-              <w:instrText xml:space="preserve"> PAGEREF _Toc225681879 \h </w:instrText>
+              <w:instrText xml:space="preserve"> PAGEREF _Toc225687418 \h </w:instrText>
+            </w:r>
+            <w:r>
+              <w:rPr>
+                <w:noProof/>
+                <w:webHidden/>
+              </w:rPr>
+            </w:r>
+            <w:r>
+              <w:rPr>
+                <w:noProof/>
+                <w:webHidden/>
+              </w:rPr>
+              <w:fldChar w:fldCharType="separate"/>
+            </w:r>
+            <w:r>
+              <w:rPr>
+                <w:noProof/>
+                <w:webHidden/>
+              </w:rPr>
+              <w:t>9</w:t>
+            </w:r>
+            <w:r>
+              <w:rPr>
+                <w:noProof/>
+                <w:webHidden/>
+              </w:rPr>
+              <w:fldChar w:fldCharType="end"/>
+            </w:r>
+          </w:hyperlink>
+        </w:p>
+        <w:p>
+          <w:pPr>
+            <w:pStyle w:val="TOC1"/>
+            <w:tabs>
+              <w:tab w:val="right" w:leader="dot" w:pos="9350"/>
+            </w:tabs>
+            <w:rPr>
+              <w:rFonts w:asciiTheme="minorHAnsi" w:eastAsiaTheme="minorEastAsia" w:hAnsiTheme="minorHAnsi" w:cstheme="minorBidi"/>
+              <w:noProof/>
+              <w:kern w:val="2"/>
+              <w14:ligatures w14:val="standardContextual"/>
+            </w:rPr>
+          </w:pPr>
+          <w:hyperlink w:anchor="_Toc225687419" w:history="1">
+            <w:r>
+              <w:rPr>
+                <w:rStyle w:val="Hyperlink"/>
+                <w:rFonts w:ascii="Calisto MT" w:hAnsi="Calisto MT"/>
+                <w:noProof/>
+              </w:rPr>
+              <w:t>8. Bonus Task - Excel Report</w:t>
+            </w:r>
+            <w:r>
+              <w:rPr>
+                <w:noProof/>
+                <w:webHidden/>
+              </w:rPr>
+              <w:tab/>
+            </w:r>
+            <w:r>
+              <w:rPr>
+                <w:noProof/>
+                <w:webHidden/>
+              </w:rPr>
+              <w:fldChar w:fldCharType="begin"/>
+            </w:r>
+            <w:r>
+              <w:rPr>
+                <w:noProof/>
+                <w:webHidden/>
+              </w:rPr>
+              <w:instrText xml:space="preserve"> PAGEREF _Toc225687419 \h </w:instrText>
             </w:r>
             <w:r>
               <w:rPr>
@@ -3402,7 +3494,7 @@
           <w:rFonts w:ascii="Calisto MT" w:hAnsi="Calisto MT"/>
         </w:rPr>
       </w:pPr>
-      <w:bookmarkStart w:id="0" w:name="_Toc225681839"/>
+      <w:bookmarkStart w:id="0" w:name="_Toc225687378"/>
       <w:r>
         <w:rPr>
           <w:rFonts w:ascii="Calisto MT" w:hAnsi="Calisto MT"/>
@@ -3458,7 +3550,27 @@
           <w:sz w:val="20"/>
           <w:szCs w:val="20"/>
         </w:rPr>
-        <w:t>[3, 4, 5, 1, 3, 4, 5, 6, 3, 5, 4, 1, 3, 5, 6, 5, 4, 3, 7, 5]</w:t>
+        <w:t xml:space="preserve">[3, 4, 5, 1, 3, 4, 5, 6, 3, 5, 4, 1, 3, 5, 6, </w:t>
+      </w:r>
+      <w:proofErr w:type="gramStart"/>
+      <w:r>
+        <w:rPr>
+          <w:rFonts w:ascii="Courier New" w:eastAsia="Courier New" w:hAnsi="Courier New" w:cs="Courier New"/>
+          <w:color w:val="1F3864"/>
+          <w:sz w:val="20"/>
+          <w:szCs w:val="20"/>
+        </w:rPr>
+        <w:t>5,</w:t>
+      </w:r>
+      <w:proofErr w:type="gramEnd"/>
+      <w:r>
+        <w:rPr>
+          <w:rFonts w:ascii="Courier New" w:eastAsia="Courier New" w:hAnsi="Courier New" w:cs="Courier New"/>
+          <w:color w:val="1F3864"/>
+          <w:sz w:val="20"/>
+          <w:szCs w:val="20"/>
+        </w:rPr>
+        <w:t xml:space="preserve"> 4, 3, 7, 5]</w:t>
       </w:r>
     </w:p>
     <w:p>
@@ -3489,7 +3601,7 @@
           <w:rFonts w:ascii="Calisto MT" w:hAnsi="Calisto MT"/>
         </w:rPr>
       </w:pPr>
-      <w:bookmarkStart w:id="1" w:name="_Toc225681840"/>
+      <w:bookmarkStart w:id="1" w:name="_Toc225687379"/>
       <w:r>
         <w:rPr>
           <w:rFonts w:ascii="Calisto MT" w:hAnsi="Calisto MT"/>
@@ -3507,7 +3619,7 @@
           <w:rFonts w:ascii="Calisto MT" w:hAnsi="Calisto MT"/>
         </w:rPr>
       </w:pPr>
-      <w:bookmarkStart w:id="2" w:name="_Toc225681841"/>
+      <w:bookmarkStart w:id="2" w:name="_Toc225687380"/>
       <w:r>
         <w:rPr>
           <w:rFonts w:ascii="Calisto MT" w:hAnsi="Calisto MT"/>
@@ -3544,7 +3656,7 @@
           <w:rFonts w:ascii="Calisto MT" w:hAnsi="Calisto MT"/>
         </w:rPr>
       </w:pPr>
-      <w:bookmarkStart w:id="3" w:name="_Toc225681842"/>
+      <w:bookmarkStart w:id="3" w:name="_Toc225687381"/>
       <w:r>
         <w:rPr>
           <w:rFonts w:ascii="Calisto MT" w:hAnsi="Calisto MT"/>
@@ -3950,7 +4062,25 @@
                 <w:sz w:val="22"/>
                 <w:szCs w:val="22"/>
               </w:rPr>
-              <w:t>Hazardous item placed outside Z5</w:t>
+              <w:t xml:space="preserve">Hazardous </w:t>
+            </w:r>
+            <w:proofErr w:type="gramStart"/>
+            <w:r>
+              <w:rPr>
+                <w:rFonts w:ascii="Calisto MT" w:hAnsi="Calisto MT"/>
+                <w:sz w:val="22"/>
+                <w:szCs w:val="22"/>
+              </w:rPr>
+              <w:t>item</w:t>
+            </w:r>
+            <w:proofErr w:type="gramEnd"/>
+            <w:r>
+              <w:rPr>
+                <w:rFonts w:ascii="Calisto MT" w:hAnsi="Calisto MT"/>
+                <w:sz w:val="22"/>
+                <w:szCs w:val="22"/>
+              </w:rPr>
+              <w:t xml:space="preserve"> placed outside Z5</w:t>
             </w:r>
           </w:p>
         </w:tc>
@@ -4051,7 +4181,25 @@
                 <w:sz w:val="22"/>
                 <w:szCs w:val="22"/>
               </w:rPr>
-              <w:t>Temp-sensitive item placed outside Z4 or Z8</w:t>
+              <w:t xml:space="preserve">Temp-sensitive </w:t>
+            </w:r>
+            <w:proofErr w:type="gramStart"/>
+            <w:r>
+              <w:rPr>
+                <w:rFonts w:ascii="Calisto MT" w:hAnsi="Calisto MT"/>
+                <w:sz w:val="22"/>
+                <w:szCs w:val="22"/>
+              </w:rPr>
+              <w:t>item</w:t>
+            </w:r>
+            <w:proofErr w:type="gramEnd"/>
+            <w:r>
+              <w:rPr>
+                <w:rFonts w:ascii="Calisto MT" w:hAnsi="Calisto MT"/>
+                <w:sz w:val="22"/>
+                <w:szCs w:val="22"/>
+              </w:rPr>
+              <w:t xml:space="preserve"> placed outside Z4 or Z8</w:t>
             </w:r>
           </w:p>
         </w:tc>
@@ -4603,7 +4751,7 @@
           <w:rFonts w:ascii="Calisto MT" w:hAnsi="Calisto MT"/>
         </w:rPr>
       </w:pPr>
-      <w:bookmarkStart w:id="4" w:name="_Toc225681843"/>
+      <w:bookmarkStart w:id="4" w:name="_Toc225687382"/>
       <w:r>
         <w:rPr>
           <w:rFonts w:ascii="Calisto MT" w:hAnsi="Calisto MT"/>
@@ -4640,7 +4788,7 @@
           <w:rFonts w:ascii="Calisto MT" w:hAnsi="Calisto MT"/>
         </w:rPr>
       </w:pPr>
-      <w:bookmarkStart w:id="5" w:name="_Toc225681844"/>
+      <w:bookmarkStart w:id="5" w:name="_Toc225687383"/>
       <w:r>
         <w:rPr>
           <w:rFonts w:ascii="Calisto MT" w:hAnsi="Calisto MT"/>
@@ -4677,7 +4825,7 @@
           <w:rFonts w:ascii="Calisto MT" w:hAnsi="Calisto MT"/>
         </w:rPr>
       </w:pPr>
-      <w:bookmarkStart w:id="6" w:name="_Toc225681845"/>
+      <w:bookmarkStart w:id="6" w:name="_Toc225687384"/>
       <w:r>
         <w:rPr>
           <w:rFonts w:ascii="Calisto MT" w:hAnsi="Calisto MT"/>
@@ -4714,7 +4862,7 @@
           <w:rFonts w:ascii="Calisto MT" w:hAnsi="Calisto MT"/>
         </w:rPr>
       </w:pPr>
-      <w:bookmarkStart w:id="7" w:name="_Toc225681846"/>
+      <w:bookmarkStart w:id="7" w:name="_Toc225687385"/>
       <w:r>
         <w:rPr>
           <w:rFonts w:ascii="Calisto MT" w:hAnsi="Calisto MT"/>
@@ -4751,7 +4899,7 @@
           <w:rFonts w:ascii="Calisto MT" w:hAnsi="Calisto MT"/>
         </w:rPr>
       </w:pPr>
-      <w:bookmarkStart w:id="8" w:name="_Toc225681847"/>
+      <w:bookmarkStart w:id="8" w:name="_Toc225687386"/>
       <w:r>
         <w:rPr>
           <w:rFonts w:ascii="Calisto MT" w:hAnsi="Calisto MT"/>
@@ -4788,7 +4936,7 @@
           <w:rFonts w:ascii="Calisto MT" w:hAnsi="Calisto MT"/>
         </w:rPr>
       </w:pPr>
-      <w:bookmarkStart w:id="9" w:name="_Toc225681848"/>
+      <w:bookmarkStart w:id="9" w:name="_Toc225687387"/>
       <w:r>
         <w:rPr>
           <w:rFonts w:ascii="Calisto MT" w:hAnsi="Calisto MT"/>
@@ -4825,7 +4973,7 @@
           <w:rFonts w:ascii="Calisto MT" w:hAnsi="Calisto MT"/>
         </w:rPr>
       </w:pPr>
-      <w:bookmarkStart w:id="10" w:name="_Toc225681849"/>
+      <w:bookmarkStart w:id="10" w:name="_Toc225687388"/>
       <w:r>
         <w:rPr>
           <w:rFonts w:ascii="Calisto MT" w:hAnsi="Calisto MT"/>
@@ -4862,7 +5010,7 @@
           <w:rFonts w:ascii="Calisto MT" w:hAnsi="Calisto MT"/>
         </w:rPr>
       </w:pPr>
-      <w:bookmarkStart w:id="11" w:name="_Toc225681850"/>
+      <w:bookmarkStart w:id="11" w:name="_Toc225687389"/>
       <w:r>
         <w:rPr>
           <w:rFonts w:ascii="Calisto MT" w:hAnsi="Calisto MT"/>
@@ -4899,7 +5047,7 @@
           <w:rFonts w:ascii="Calisto MT" w:hAnsi="Calisto MT"/>
         </w:rPr>
       </w:pPr>
-      <w:bookmarkStart w:id="12" w:name="_Toc225681851"/>
+      <w:bookmarkStart w:id="12" w:name="_Toc225687390"/>
       <w:r>
         <w:rPr>
           <w:rFonts w:ascii="Calisto MT" w:hAnsi="Calisto MT"/>
@@ -4919,7 +5067,35 @@
         <w:rPr>
           <w:rFonts w:ascii="Calisto MT" w:hAnsi="Calisto MT"/>
         </w:rPr>
-        <w:t>For each zone, food_count x chem_count gives the number of food-chemical pairs sharing that zone. Penalty = pairs x 15.</w:t>
+        <w:t xml:space="preserve">For each zone, </w:t>
+      </w:r>
+      <w:proofErr w:type="spellStart"/>
+      <w:r>
+        <w:rPr>
+          <w:rFonts w:ascii="Calisto MT" w:hAnsi="Calisto MT"/>
+        </w:rPr>
+        <w:t>food_count</w:t>
+      </w:r>
+      <w:proofErr w:type="spellEnd"/>
+      <w:r>
+        <w:rPr>
+          <w:rFonts w:ascii="Calisto MT" w:hAnsi="Calisto MT"/>
+        </w:rPr>
+        <w:t xml:space="preserve"> x </w:t>
+      </w:r>
+      <w:proofErr w:type="spellStart"/>
+      <w:r>
+        <w:rPr>
+          <w:rFonts w:ascii="Calisto MT" w:hAnsi="Calisto MT"/>
+        </w:rPr>
+        <w:t>chem_count</w:t>
+      </w:r>
+      <w:proofErr w:type="spellEnd"/>
+      <w:r>
+        <w:rPr>
+          <w:rFonts w:ascii="Calisto MT" w:hAnsi="Calisto MT"/>
+        </w:rPr>
+        <w:t xml:space="preserve"> gives the number of food-chemical pairs sharing that zone. Penalty = pairs x 15.</w:t>
       </w:r>
     </w:p>
     <w:p>
@@ -4936,7 +5112,7 @@
           <w:rFonts w:ascii="Calisto MT" w:hAnsi="Calisto MT"/>
         </w:rPr>
       </w:pPr>
-      <w:bookmarkStart w:id="13" w:name="_Toc225681852"/>
+      <w:bookmarkStart w:id="13" w:name="_Toc225687391"/>
       <w:r>
         <w:rPr>
           <w:rFonts w:ascii="Calisto MT" w:hAnsi="Calisto MT"/>
@@ -4973,7 +5149,7 @@
           <w:rFonts w:ascii="Calisto MT" w:hAnsi="Calisto MT"/>
         </w:rPr>
       </w:pPr>
-      <w:bookmarkStart w:id="14" w:name="_Toc225681853"/>
+      <w:bookmarkStart w:id="14" w:name="_Toc225687392"/>
       <w:r>
         <w:rPr>
           <w:rFonts w:ascii="Calisto MT" w:hAnsi="Calisto MT"/>
@@ -5042,11 +5218,19 @@
           <w:rFonts w:ascii="Calisto MT" w:hAnsi="Calisto MT"/>
         </w:rPr>
       </w:pPr>
-      <w:r>
-        <w:rPr>
-          <w:rFonts w:ascii="Calisto MT" w:hAnsi="Calisto MT"/>
-        </w:rPr>
-        <w:t>So the GA minimizes the penalty as much as possible instead of reaching zero.</w:t>
+      <w:proofErr w:type="gramStart"/>
+      <w:r>
+        <w:rPr>
+          <w:rFonts w:ascii="Calisto MT" w:hAnsi="Calisto MT"/>
+        </w:rPr>
+        <w:t>So</w:t>
+      </w:r>
+      <w:proofErr w:type="gramEnd"/>
+      <w:r>
+        <w:rPr>
+          <w:rFonts w:ascii="Calisto MT" w:hAnsi="Calisto MT"/>
+        </w:rPr>
+        <w:t xml:space="preserve"> the GA minimizes the penalty as much as possible instead of reaching zero.</w:t>
       </w:r>
     </w:p>
     <w:p>
@@ -5063,7 +5247,7 @@
           <w:rFonts w:ascii="Calisto MT" w:hAnsi="Calisto MT"/>
         </w:rPr>
       </w:pPr>
-      <w:bookmarkStart w:id="15" w:name="_Toc225681854"/>
+      <w:bookmarkStart w:id="15" w:name="_Toc225687393"/>
       <w:r>
         <w:rPr>
           <w:rFonts w:ascii="Calisto MT" w:hAnsi="Calisto MT"/>
@@ -5081,7 +5265,7 @@
           <w:rFonts w:ascii="Calisto MT" w:hAnsi="Calisto MT"/>
         </w:rPr>
       </w:pPr>
-      <w:bookmarkStart w:id="16" w:name="_Toc225681855"/>
+      <w:bookmarkStart w:id="16" w:name="_Toc225687394"/>
       <w:r>
         <w:rPr>
           <w:rFonts w:ascii="Calisto MT" w:hAnsi="Calisto MT"/>
@@ -5097,7 +5281,7 @@
           <w:rFonts w:ascii="Calisto MT" w:hAnsi="Calisto MT"/>
         </w:rPr>
       </w:pPr>
-      <w:bookmarkStart w:id="17" w:name="_Toc225681856"/>
+      <w:bookmarkStart w:id="17" w:name="_Toc225687395"/>
       <w:r>
         <w:rPr>
           <w:rFonts w:ascii="Calisto MT" w:hAnsi="Calisto MT"/>
@@ -5134,7 +5318,7 @@
           <w:rFonts w:ascii="Calisto MT" w:hAnsi="Calisto MT"/>
         </w:rPr>
       </w:pPr>
-      <w:bookmarkStart w:id="18" w:name="_Toc225681857"/>
+      <w:bookmarkStart w:id="18" w:name="_Toc225687396"/>
       <w:r>
         <w:rPr>
           <w:rFonts w:ascii="Calisto MT" w:hAnsi="Calisto MT"/>
@@ -5154,13 +5338,27 @@
         <w:rPr>
           <w:rFonts w:ascii="Calisto MT" w:hAnsi="Calisto MT"/>
         </w:rPr>
-        <w:t xml:space="preserve">For this, </w:t>
-      </w:r>
-      <w:r>
-        <w:rPr>
-          <w:rFonts w:ascii="Calisto MT" w:hAnsi="Calisto MT"/>
-        </w:rPr>
-        <w:t>k random chromosomes are picked and the one with lowest fitness wins. This is repeated to select each parent.</w:t>
+        <w:t>For this</w:t>
+      </w:r>
+      <w:proofErr w:type="gramStart"/>
+      <w:r>
+        <w:rPr>
+          <w:rFonts w:ascii="Calisto MT" w:hAnsi="Calisto MT"/>
+        </w:rPr>
+        <w:t xml:space="preserve">, </w:t>
+      </w:r>
+      <w:r>
+        <w:rPr>
+          <w:rFonts w:ascii="Calisto MT" w:hAnsi="Calisto MT"/>
+        </w:rPr>
+        <w:t>k</w:t>
+      </w:r>
+      <w:proofErr w:type="gramEnd"/>
+      <w:r>
+        <w:rPr>
+          <w:rFonts w:ascii="Calisto MT" w:hAnsi="Calisto MT"/>
+        </w:rPr>
+        <w:t xml:space="preserve"> random chromosomes are picked and the one with lowest fitness wins. This is repeated to select each parent.</w:t>
       </w:r>
     </w:p>
     <w:p>
@@ -5177,7 +5375,7 @@
           <w:rFonts w:ascii="Calisto MT" w:hAnsi="Calisto MT"/>
         </w:rPr>
       </w:pPr>
-      <w:bookmarkStart w:id="19" w:name="_Toc225681858"/>
+      <w:bookmarkStart w:id="19" w:name="_Toc225687397"/>
       <w:r>
         <w:rPr>
           <w:rFonts w:ascii="Calisto MT" w:hAnsi="Calisto MT"/>
@@ -5214,7 +5412,7 @@
           <w:rFonts w:ascii="Calisto MT" w:hAnsi="Calisto MT"/>
         </w:rPr>
       </w:pPr>
-      <w:bookmarkStart w:id="20" w:name="_Toc225681859"/>
+      <w:bookmarkStart w:id="20" w:name="_Toc225687398"/>
       <w:r>
         <w:rPr>
           <w:rFonts w:ascii="Calisto MT" w:hAnsi="Calisto MT"/>
@@ -5251,7 +5449,7 @@
           <w:rFonts w:ascii="Calisto MT" w:hAnsi="Calisto MT"/>
         </w:rPr>
       </w:pPr>
-      <w:bookmarkStart w:id="21" w:name="_Toc225681860"/>
+      <w:bookmarkStart w:id="21" w:name="_Toc225687399"/>
       <w:r>
         <w:rPr>
           <w:rFonts w:ascii="Calisto MT" w:hAnsi="Calisto MT"/>
@@ -5331,7 +5529,7 @@
           <w:rFonts w:ascii="Calisto MT" w:hAnsi="Calisto MT"/>
         </w:rPr>
       </w:pPr>
-      <w:bookmarkStart w:id="22" w:name="_Toc225681861"/>
+      <w:bookmarkStart w:id="22" w:name="_Toc225687400"/>
       <w:r>
         <w:rPr>
           <w:rFonts w:ascii="Calisto MT" w:hAnsi="Calisto MT"/>
@@ -5375,8 +5573,16 @@
         <w:rPr>
           <w:rFonts w:ascii="Calisto MT" w:hAnsi="Calisto MT"/>
         </w:rPr>
-        <w:t>Rank Selection: more stable but loses information about how different the fitness values actually are</w:t>
-      </w:r>
+        <w:t xml:space="preserve">Rank Selection: more stable but loses information about how different the fitness values </w:t>
+      </w:r>
+      <w:proofErr w:type="gramStart"/>
+      <w:r>
+        <w:rPr>
+          <w:rFonts w:ascii="Calisto MT" w:hAnsi="Calisto MT"/>
+        </w:rPr>
+        <w:t>actually are</w:t>
+      </w:r>
+      <w:proofErr w:type="gramEnd"/>
     </w:p>
     <w:p>
       <w:pPr>
@@ -5392,7 +5598,7 @@
           <w:rFonts w:ascii="Calisto MT" w:hAnsi="Calisto MT"/>
         </w:rPr>
       </w:pPr>
-      <w:bookmarkStart w:id="23" w:name="_Toc225681862"/>
+      <w:bookmarkStart w:id="23" w:name="_Toc225687401"/>
       <w:r>
         <w:rPr>
           <w:rFonts w:ascii="Calisto MT" w:hAnsi="Calisto MT"/>
@@ -5411,7 +5617,7 @@
           <w:rFonts w:ascii="Calisto MT" w:hAnsi="Calisto MT"/>
         </w:rPr>
       </w:pPr>
-      <w:bookmarkStart w:id="24" w:name="_Toc225681863"/>
+      <w:bookmarkStart w:id="24" w:name="_Toc225687402"/>
       <w:r>
         <w:rPr>
           <w:rFonts w:ascii="Calisto MT" w:hAnsi="Calisto MT"/>
@@ -5427,7 +5633,7 @@
           <w:rFonts w:ascii="Calisto MT" w:hAnsi="Calisto MT"/>
         </w:rPr>
       </w:pPr>
-      <w:bookmarkStart w:id="25" w:name="_Toc225681864"/>
+      <w:bookmarkStart w:id="25" w:name="_Toc225687403"/>
       <w:r>
         <w:rPr>
           <w:rFonts w:ascii="Calisto MT" w:hAnsi="Calisto MT"/>
@@ -5464,7 +5670,7 @@
           <w:rFonts w:ascii="Calisto MT" w:hAnsi="Calisto MT"/>
         </w:rPr>
       </w:pPr>
-      <w:bookmarkStart w:id="26" w:name="_Toc225681865"/>
+      <w:bookmarkStart w:id="26" w:name="_Toc225687404"/>
       <w:r>
         <w:rPr>
           <w:rFonts w:ascii="Calisto MT" w:hAnsi="Calisto MT"/>
@@ -5501,7 +5707,7 @@
           <w:rFonts w:ascii="Calisto MT" w:hAnsi="Calisto MT"/>
         </w:rPr>
       </w:pPr>
-      <w:bookmarkStart w:id="27" w:name="_Toc225681866"/>
+      <w:bookmarkStart w:id="27" w:name="_Toc225687405"/>
       <w:r>
         <w:rPr>
           <w:rFonts w:ascii="Calisto MT" w:hAnsi="Calisto MT"/>
@@ -5538,7 +5744,7 @@
           <w:rFonts w:ascii="Calisto MT" w:hAnsi="Calisto MT"/>
         </w:rPr>
       </w:pPr>
-      <w:bookmarkStart w:id="28" w:name="_Toc225681867"/>
+      <w:bookmarkStart w:id="28" w:name="_Toc225687406"/>
       <w:r>
         <w:rPr>
           <w:rFonts w:ascii="Calisto MT" w:hAnsi="Calisto MT"/>
@@ -5618,12 +5824,40 @@
           <w:rFonts w:ascii="Calisto MT" w:hAnsi="Calisto MT"/>
         </w:rPr>
       </w:pPr>
-      <w:bookmarkStart w:id="29" w:name="_Toc225681868"/>
-      <w:r>
-        <w:rPr>
-          <w:rFonts w:ascii="Calisto MT" w:hAnsi="Calisto MT"/>
-        </w:rPr>
-        <w:t>4.4 How It Works In The Code</w:t>
+      <w:bookmarkStart w:id="29" w:name="_Toc225687407"/>
+      <w:r>
+        <w:rPr>
+          <w:rFonts w:ascii="Calisto MT" w:hAnsi="Calisto MT"/>
+        </w:rPr>
+        <w:t xml:space="preserve">4.4 How It Works </w:t>
+      </w:r>
+      <w:proofErr w:type="gramStart"/>
+      <w:r>
+        <w:rPr>
+          <w:rFonts w:ascii="Calisto MT" w:hAnsi="Calisto MT"/>
+        </w:rPr>
+        <w:t>In</w:t>
+      </w:r>
+      <w:proofErr w:type="gramEnd"/>
+      <w:r>
+        <w:rPr>
+          <w:rFonts w:ascii="Calisto MT" w:hAnsi="Calisto MT"/>
+        </w:rPr>
+        <w:t xml:space="preserve"> </w:t>
+      </w:r>
+      <w:proofErr w:type="gramStart"/>
+      <w:r>
+        <w:rPr>
+          <w:rFonts w:ascii="Calisto MT" w:hAnsi="Calisto MT"/>
+        </w:rPr>
+        <w:t>The</w:t>
+      </w:r>
+      <w:proofErr w:type="gramEnd"/>
+      <w:r>
+        <w:rPr>
+          <w:rFonts w:ascii="Calisto MT" w:hAnsi="Calisto MT"/>
+        </w:rPr>
+        <w:t xml:space="preserve"> Code</w:t>
       </w:r>
       <w:bookmarkEnd w:id="29"/>
     </w:p>
@@ -5665,7 +5899,27 @@
           <w:sz w:val="20"/>
           <w:szCs w:val="20"/>
         </w:rPr>
-        <w:t>child2 = parent2[:pt1] + parent1[pt1:pt2] + parent2[pt2:]</w:t>
+        <w:t xml:space="preserve">child2 = </w:t>
+      </w:r>
+      <w:proofErr w:type="gramStart"/>
+      <w:r>
+        <w:rPr>
+          <w:rFonts w:ascii="Courier New" w:eastAsia="Courier New" w:hAnsi="Courier New" w:cs="Courier New"/>
+          <w:color w:val="1F3864"/>
+          <w:sz w:val="20"/>
+          <w:szCs w:val="20"/>
+        </w:rPr>
+        <w:t>parent2[:</w:t>
+      </w:r>
+      <w:proofErr w:type="gramEnd"/>
+      <w:r>
+        <w:rPr>
+          <w:rFonts w:ascii="Courier New" w:eastAsia="Courier New" w:hAnsi="Courier New" w:cs="Courier New"/>
+          <w:color w:val="1F3864"/>
+          <w:sz w:val="20"/>
+          <w:szCs w:val="20"/>
+        </w:rPr>
+        <w:t>pt1] + parent1[pt1:pt2] + parent2[pt2:]</w:t>
       </w:r>
     </w:p>
     <w:p/>
@@ -5676,7 +5930,7 @@
           <w:rFonts w:ascii="Calisto MT" w:hAnsi="Calisto MT"/>
         </w:rPr>
       </w:pPr>
-      <w:bookmarkStart w:id="30" w:name="_Toc225681869"/>
+      <w:bookmarkStart w:id="30" w:name="_Toc225687408"/>
       <w:r>
         <w:rPr>
           <w:rFonts w:ascii="Calisto MT" w:hAnsi="Calisto MT"/>
@@ -5694,7 +5948,7 @@
           <w:rFonts w:ascii="Calisto MT" w:hAnsi="Calisto MT"/>
         </w:rPr>
       </w:pPr>
-      <w:bookmarkStart w:id="31" w:name="_Toc225681870"/>
+      <w:bookmarkStart w:id="31" w:name="_Toc225687409"/>
       <w:r>
         <w:rPr>
           <w:rFonts w:ascii="Calisto MT" w:hAnsi="Calisto MT"/>
@@ -5731,7 +5985,7 @@
           <w:rFonts w:ascii="Calisto MT" w:hAnsi="Calisto MT"/>
         </w:rPr>
       </w:pPr>
-      <w:bookmarkStart w:id="32" w:name="_Toc225681871"/>
+      <w:bookmarkStart w:id="32" w:name="_Toc225687410"/>
       <w:r>
         <w:rPr>
           <w:rFonts w:ascii="Calisto MT" w:hAnsi="Calisto MT"/>
@@ -5840,7 +6094,7 @@
           <w:rFonts w:ascii="Calisto MT" w:hAnsi="Calisto MT"/>
         </w:rPr>
       </w:pPr>
-      <w:bookmarkStart w:id="33" w:name="_Toc225681872"/>
+      <w:bookmarkStart w:id="33" w:name="_Toc225687411"/>
       <w:r>
         <w:rPr>
           <w:rFonts w:ascii="Calisto MT" w:hAnsi="Calisto MT"/>
@@ -5858,7 +6112,7 @@
           <w:rFonts w:ascii="Calisto MT" w:hAnsi="Calisto MT"/>
         </w:rPr>
       </w:pPr>
-      <w:bookmarkStart w:id="34" w:name="_Toc225681873"/>
+      <w:bookmarkStart w:id="34" w:name="_Toc225687412"/>
       <w:r>
         <w:rPr>
           <w:rFonts w:ascii="Calisto MT" w:hAnsi="Calisto MT"/>
@@ -5933,7 +6187,7 @@
           <w:rFonts w:ascii="Calisto MT" w:hAnsi="Calisto MT"/>
         </w:rPr>
       </w:pPr>
-      <w:bookmarkStart w:id="35" w:name="_Toc225681874"/>
+      <w:bookmarkStart w:id="35" w:name="_Toc225687413"/>
       <w:r>
         <w:rPr>
           <w:rFonts w:ascii="Calisto MT" w:hAnsi="Calisto MT"/>
@@ -6008,7 +6262,7 @@
           <w:rFonts w:ascii="Calisto MT" w:hAnsi="Calisto MT"/>
         </w:rPr>
       </w:pPr>
-      <w:bookmarkStart w:id="36" w:name="_Toc225681875"/>
+      <w:bookmarkStart w:id="36" w:name="_Toc225687414"/>
       <w:r>
         <w:rPr>
           <w:rFonts w:ascii="Calisto MT" w:hAnsi="Calisto MT"/>
@@ -6568,7 +6822,7 @@
           <w:rFonts w:ascii="Calisto MT" w:hAnsi="Calisto MT"/>
         </w:rPr>
       </w:pPr>
-      <w:bookmarkStart w:id="37" w:name="_Toc225681876"/>
+      <w:bookmarkStart w:id="37" w:name="_Toc225687415"/>
       <w:r>
         <w:rPr>
           <w:rFonts w:ascii="Calisto MT" w:hAnsi="Calisto MT"/>
@@ -6586,7 +6840,7 @@
           <w:rFonts w:ascii="Calisto MT" w:hAnsi="Calisto MT"/>
         </w:rPr>
       </w:pPr>
-      <w:bookmarkStart w:id="38" w:name="_Toc225681877"/>
+      <w:bookmarkStart w:id="38" w:name="_Toc225687416"/>
       <w:r>
         <w:rPr>
           <w:rFonts w:ascii="Calisto MT" w:hAnsi="Calisto MT"/>
@@ -6623,7 +6877,7 @@
           <w:rFonts w:ascii="Calisto MT" w:hAnsi="Calisto MT"/>
         </w:rPr>
       </w:pPr>
-      <w:bookmarkStart w:id="39" w:name="_Toc225681878"/>
+      <w:bookmarkStart w:id="39" w:name="_Toc225687417"/>
       <w:r>
         <w:rPr>
           <w:rFonts w:ascii="Calisto MT" w:hAnsi="Calisto MT"/>
@@ -7588,7 +7842,7 @@
           <w:rFonts w:ascii="Calisto MT" w:hAnsi="Calisto MT"/>
         </w:rPr>
       </w:pPr>
-      <w:bookmarkStart w:id="40" w:name="_Toc225681879"/>
+      <w:bookmarkStart w:id="40" w:name="_Toc225687418"/>
       <w:r>
         <w:rPr>
           <w:rFonts w:ascii="Calisto MT" w:hAnsi="Calisto MT"/>
@@ -7674,6 +7928,7 @@
           <w:szCs w:val="32"/>
         </w:rPr>
       </w:pPr>
+      <w:bookmarkStart w:id="41" w:name="_Toc225687419"/>
       <w:r>
         <w:rPr>
           <w:rFonts w:ascii="Calisto MT" w:hAnsi="Calisto MT"/>
@@ -7698,18 +7953,61 @@
         </w:rPr>
         <w:t xml:space="preserve"> Excel Report</w:t>
       </w:r>
-    </w:p>
-    <w:p>
-      <w:pPr>
-        <w:rPr>
-          <w:rFonts w:ascii="Calisto MT" w:hAnsi="Calisto MT"/>
-        </w:rPr>
-      </w:pPr>
-      <w:r>
-        <w:rPr>
-          <w:rFonts w:ascii="Calisto MT" w:hAnsi="Calisto MT"/>
-        </w:rPr>
-        <w:t>The export_to_excel() function saves the final storage plan to an Excel file (optimized_warehouse.xlsx) using pandas and openpyxl. The file has 3 sheets:</w:t>
+      <w:bookmarkEnd w:id="41"/>
+    </w:p>
+    <w:p>
+      <w:pPr>
+        <w:rPr>
+          <w:rFonts w:ascii="Calisto MT" w:hAnsi="Calisto MT"/>
+        </w:rPr>
+      </w:pPr>
+      <w:r>
+        <w:rPr>
+          <w:rFonts w:ascii="Calisto MT" w:hAnsi="Calisto MT"/>
+        </w:rPr>
+        <w:t xml:space="preserve">The </w:t>
+      </w:r>
+      <w:proofErr w:type="spellStart"/>
+      <w:r>
+        <w:rPr>
+          <w:rFonts w:ascii="Calisto MT" w:hAnsi="Calisto MT"/>
+        </w:rPr>
+        <w:t>export_to_</w:t>
+      </w:r>
+      <w:proofErr w:type="gramStart"/>
+      <w:r>
+        <w:rPr>
+          <w:rFonts w:ascii="Calisto MT" w:hAnsi="Calisto MT"/>
+        </w:rPr>
+        <w:t>excel</w:t>
+      </w:r>
+      <w:proofErr w:type="spellEnd"/>
+      <w:r>
+        <w:rPr>
+          <w:rFonts w:ascii="Calisto MT" w:hAnsi="Calisto MT"/>
+        </w:rPr>
+        <w:t>(</w:t>
+      </w:r>
+      <w:proofErr w:type="gramEnd"/>
+      <w:r>
+        <w:rPr>
+          <w:rFonts w:ascii="Calisto MT" w:hAnsi="Calisto MT"/>
+        </w:rPr>
+        <w:t xml:space="preserve">) function saves the final storage plan to an Excel file (optimized_warehouse.xlsx) using pandas and </w:t>
+      </w:r>
+      <w:proofErr w:type="spellStart"/>
+      <w:r>
+        <w:rPr>
+          <w:rFonts w:ascii="Calisto MT" w:hAnsi="Calisto MT"/>
+        </w:rPr>
+        <w:t>openpyxl</w:t>
+      </w:r>
+      <w:proofErr w:type="spellEnd"/>
+      <w:r>
+        <w:rPr>
+          <w:rFonts w:ascii="Calisto MT" w:hAnsi="Calisto MT"/>
+        </w:rPr>
+        <w:t>. The file has 3 sheets:</w:t>
       </w:r>
     </w:p>
     <w:p>
@@ -7784,7 +8082,35 @@
         <w:rPr>
           <w:rFonts w:ascii="Calisto MT" w:hAnsi="Calisto MT"/>
         </w:rPr>
-        <w:t xml:space="preserve"> shows the best fitness score and overall stats.</w:t>
+        <w:t xml:space="preserve"> </w:t>
+      </w:r>
+      <w:proofErr w:type="gramStart"/>
+      <w:r>
+        <w:rPr>
+          <w:rFonts w:ascii="Calisto MT" w:hAnsi="Calisto MT"/>
+        </w:rPr>
+        <w:t>shows</w:t>
+      </w:r>
+      <w:proofErr w:type="gramEnd"/>
+      <w:r>
+        <w:rPr>
+          <w:rFonts w:ascii="Calisto MT" w:hAnsi="Calisto MT"/>
+        </w:rPr>
+        <w:t xml:space="preserve"> the best fitness score and overall </w:t>
+      </w:r>
+      <w:proofErr w:type="gramStart"/>
+      <w:r>
+        <w:rPr>
+          <w:rFonts w:ascii="Calisto MT" w:hAnsi="Calisto MT"/>
+        </w:rPr>
+        <w:t>stats</w:t>
+      </w:r>
+      <w:proofErr w:type="gramEnd"/>
+      <w:r>
+        <w:rPr>
+          <w:rFonts w:ascii="Calisto MT" w:hAnsi="Calisto MT"/>
+        </w:rPr>
+        <w:t>.</w:t>
       </w:r>
     </w:p>
     <w:p/>
@@ -8746,6 +9072,7 @@
   <w:style w:type="character" w:default="1" w:styleId="DefaultParagraphFont">
     <w:name w:val="Default Paragraph Font"/>
     <w:uiPriority w:val="1"/>
+    <w:semiHidden/>
     <w:unhideWhenUsed/>
   </w:style>
   <w:style w:type="table" w:default="1" w:styleId="TableNormal">

</xml_diff>